<commit_message>
Fix 'six additions' → 'seven additions' in evidence weighting doc
Review finding: count was not updated after Addition 7 (Stakeholder
Contradiction Report) was added to the document.

Co-Authored-By: Claude Opus 4.6 (1M context) <noreply@anthropic.com>
</commit_message>
<xml_diff>
--- a/docs/architecture/km4processbot-evidence-weighting-additions.docx
+++ b/docs/architecture/km4processbot-evidence-weighting-additions.docx
@@ -25,7 +25,7 @@
         <w:pStyle w:val="FirstParagraph"/>
       </w:pPr>
       <w:r>
-        <w:t xml:space="preserve">This document defines six additions to KM4ProcessBot v1 that make its interview methodology</w:t>
+        <w:t xml:space="preserve">This document defines seven additions to KM4ProcessBot v1 that make its interview methodology</w:t>
       </w:r>
       <w:r>
         <w:t xml:space="preserve"> </w:t>
@@ -6820,13 +6820,13 @@
         <w:t xml:space="preserve">Integration Summary</w:t>
       </w:r>
     </w:p>
-    <w:bookmarkStart w:id="45" w:name="Xa7848c66fb5fb307f95264a1073fb3eb4d21c86"/>
+    <w:bookmarkStart w:id="45" w:name="X88a68d7cf5175007f30fe087b1236a955b71209"/>
     <w:p>
       <w:pPr>
         <w:pStyle w:val="Heading3"/>
       </w:pPr>
       <w:r>
-        <w:t xml:space="preserve">How These Six Additions Flow Through the Consensus Algorithm</w:t>
+        <w:t xml:space="preserve">How These Seven Additions Flow Through the Consensus Algorithm</w:t>
       </w:r>
     </w:p>
     <w:p>

</xml_diff>